<commit_message>
ADR 0003 and document updates for the account-security implementation
- docs/adr/0003-account-security-in-the-database.md: tenant-status access
  (O-18), mandatory MFA, the 035 procedures, the denied direct rights, O-19,
  error numbers, tests, accepted residual risks and what is not built yet.
- ADR 0002 amended (50006 after a proven password, MFA always required).
- Open-items register: O-18, O-19 closed; O-24 closed for R1, R3, R4, R5;
  ERD Word document rebuilt (charts unchanged).
- Database design 3.2, O-9, test counts and tp_app grants updated.
- Readiness documents F03, F04, S01, S03, S04: implementation note and
  closed rows; their Word files and the P0 volume rebuilt.
- Owner decisions register records that items 1-4 of 1.1 are implemented.

Claude-Session: https://claude.ai/code/session_012HHcRrzuvMBTL2FYxXtsyv
</commit_message>
<xml_diff>
--- a/treasury-platform/docs/30-readiness/word/DOC-F03-login-mfa-recovery-sequence.docx
+++ b/treasury-platform/docs/30-readiness/word/DOC-F03-login-mfa-recovery-sequence.docx
@@ -1018,6 +1018,307 @@
     </w:p>
     <w:p>
       <w:pPr>
+        <w:pBdr>
+          <w:top w:val="single" w:color="E8C766" w:sz="6" w:space="6"/>
+          <w:left w:val="single" w:color="E8C766" w:sz="6" w:space="6"/>
+          <w:bottom w:val="single" w:color="E8C766" w:sz="6" w:space="6"/>
+          <w:right w:val="single" w:color="E8C766" w:sz="6" w:space="6"/>
+        </w:pBdr>
+        <w:shd w:fill="FFF8E1" w:color="auto" w:val="clear"/>
+        <w:bidi/>
+        <w:spacing w:after="160" w:before="60" w:line="300"/>
+        <w:ind w:left="140" w:right="140"/>
+      </w:pPr>
+      <w:r>
+        <w:rPr>
+          <w:rFonts w:ascii="Arial" w:cs="Arial" w:eastAsia="Arial" w:hAnsi="Arial"/>
+          <w:b/>
+          <w:bCs/>
+          <w:sz w:val="20"/>
+          <w:szCs w:val="20"/>
+          <w:rtl/>
+        </w:rPr>
+        <w:t xml:space="preserve">تحديث التنفيذ (2026-10-12):</w:t>
+      </w:r>
+      <w:r>
+        <w:rPr>
+          <w:rFonts w:ascii="Arial" w:cs="Arial" w:eastAsia="Arial" w:hAnsi="Arial"/>
+          <w:b w:val="false"/>
+          <w:bCs w:val="false"/>
+          <w:sz w:val="20"/>
+          <w:szCs w:val="20"/>
+          <w:rtl/>
+        </w:rPr>
+        <w:t xml:space="preserve"> نُفّذت قرارات المالك لبوابة S0 في القاعدة (docs/adr/0003-account-security-in-the-database.md، db/static/030_session_context.sql، db/static/035_account_security.sql) وتمر في CI (48 حالة عزل و14 حالة حسابات في db/tests/auth_flow_tests.sql). أرقام الأسطر المذكورة لملف 030 في هذه الوثيقة تسبق هذا التحديث.</w:t>
+      </w:r>
+    </w:p>
+    <w:p>
+      <w:pPr>
+        <w:pBdr>
+          <w:top w:val="single" w:color="E8C766" w:sz="6" w:space="6"/>
+          <w:left w:val="single" w:color="E8C766" w:sz="6" w:space="6"/>
+          <w:bottom w:val="single" w:color="E8C766" w:sz="6" w:space="6"/>
+          <w:right w:val="single" w:color="E8C766" w:sz="6" w:space="6"/>
+        </w:pBdr>
+        <w:shd w:fill="FFF8E1" w:color="auto" w:val="clear"/>
+        <w:bidi/>
+        <w:spacing w:after="160" w:before="60" w:line="300"/>
+        <w:ind w:left="140" w:right="140"/>
+      </w:pPr>
+      <w:r>
+        <w:rPr>
+          <w:rFonts w:ascii="Arial" w:cs="Arial" w:eastAsia="Arial" w:hAnsi="Arial"/>
+          <w:b w:val="false"/>
+          <w:bCs w:val="false"/>
+          <w:sz w:val="20"/>
+          <w:szCs w:val="20"/>
+          <w:rtl/>
+        </w:rPr>
+        <w:t xml:space="preserve">ما يخص هذه الوثيقة: MFA إلزامي ولا ربط قبله (DQ-F03-4)؛ مسار ما قبل الدخول بإجراءات ضيقة (DQ-F03-1): </w:t>
+      </w:r>
+      <w:r>
+        <w:rPr>
+          <w:rFonts w:ascii="Courier New" w:cs="Courier New" w:eastAsia="Courier New" w:hAnsi="Courier New"/>
+          <w:b w:val="false"/>
+          <w:bCs w:val="false"/>
+          <w:color w:val="1F2937"/>
+          <w:sz w:val="18"/>
+          <w:szCs w:val="18"/>
+          <w:shd w:fill="F1F3F5" w:color="auto" w:val="clear"/>
+          <w:rtl/>
+        </w:rPr>
+        <w:t xml:space="preserve">‎usp_ResolveTenant‎</w:t>
+      </w:r>
+      <w:r>
+        <w:rPr>
+          <w:rFonts w:ascii="Arial" w:cs="Arial" w:eastAsia="Arial" w:hAnsi="Arial"/>
+          <w:b w:val="false"/>
+          <w:bCs w:val="false"/>
+          <w:sz w:val="20"/>
+          <w:szCs w:val="20"/>
+          <w:rtl/>
+        </w:rPr>
+        <w:t xml:space="preserve"> و</w:t>
+      </w:r>
+      <w:r>
+        <w:rPr>
+          <w:rFonts w:ascii="Courier New" w:cs="Courier New" w:eastAsia="Courier New" w:hAnsi="Courier New"/>
+          <w:b w:val="false"/>
+          <w:bCs w:val="false"/>
+          <w:color w:val="1F2937"/>
+          <w:sz w:val="18"/>
+          <w:szCs w:val="18"/>
+          <w:shd w:fill="F1F3F5" w:color="auto" w:val="clear"/>
+          <w:rtl/>
+        </w:rPr>
+        <w:t xml:space="preserve">‎usp_GetMfaChallenge‎</w:t>
+      </w:r>
+      <w:r>
+        <w:rPr>
+          <w:rFonts w:ascii="Arial" w:cs="Arial" w:eastAsia="Arial" w:hAnsi="Arial"/>
+          <w:b w:val="false"/>
+          <w:bCs w:val="false"/>
+          <w:sz w:val="20"/>
+          <w:szCs w:val="20"/>
+          <w:rtl/>
+        </w:rPr>
+        <w:t xml:space="preserve"> و</w:t>
+      </w:r>
+      <w:r>
+        <w:rPr>
+          <w:rFonts w:ascii="Courier New" w:cs="Courier New" w:eastAsia="Courier New" w:hAnsi="Courier New"/>
+          <w:b w:val="false"/>
+          <w:bCs w:val="false"/>
+          <w:color w:val="1F2937"/>
+          <w:sz w:val="18"/>
+          <w:szCs w:val="18"/>
+          <w:shd w:fill="F1F3F5" w:color="auto" w:val="clear"/>
+          <w:rtl/>
+        </w:rPr>
+        <w:t xml:space="preserve">‎usp_CompleteMfaEnrolment‎</w:t>
+      </w:r>
+      <w:r>
+        <w:rPr>
+          <w:rFonts w:ascii="Arial" w:cs="Arial" w:eastAsia="Arial" w:hAnsi="Arial"/>
+          <w:b w:val="false"/>
+          <w:bCs w:val="false"/>
+          <w:sz w:val="20"/>
+          <w:szCs w:val="20"/>
+          <w:rtl/>
+        </w:rPr>
+        <w:t xml:space="preserve"> و</w:t>
+      </w:r>
+      <w:r>
+        <w:rPr>
+          <w:rFonts w:ascii="Courier New" w:cs="Courier New" w:eastAsia="Courier New" w:hAnsi="Courier New"/>
+          <w:b w:val="false"/>
+          <w:bCs w:val="false"/>
+          <w:color w:val="1F2937"/>
+          <w:sz w:val="18"/>
+          <w:szCs w:val="18"/>
+          <w:shd w:fill="F1F3F5" w:color="auto" w:val="clear"/>
+          <w:rtl/>
+        </w:rPr>
+        <w:t xml:space="preserve">‎usp_UseRecoveryCode‎</w:t>
+      </w:r>
+      <w:r>
+        <w:rPr>
+          <w:rFonts w:ascii="Arial" w:cs="Arial" w:eastAsia="Arial" w:hAnsi="Arial"/>
+          <w:b w:val="false"/>
+          <w:bCs w:val="false"/>
+          <w:sz w:val="20"/>
+          <w:szCs w:val="20"/>
+          <w:rtl/>
+        </w:rPr>
+        <w:t xml:space="preserve"> و</w:t>
+      </w:r>
+      <w:r>
+        <w:rPr>
+          <w:rFonts w:ascii="Courier New" w:cs="Courier New" w:eastAsia="Courier New" w:hAnsi="Courier New"/>
+          <w:b w:val="false"/>
+          <w:bCs w:val="false"/>
+          <w:color w:val="1F2937"/>
+          <w:sz w:val="18"/>
+          <w:szCs w:val="18"/>
+          <w:shd w:fill="F1F3F5" w:color="auto" w:val="clear"/>
+          <w:rtl/>
+        </w:rPr>
+        <w:t xml:space="preserve">‎usp_CompleteInvitation‎</w:t>
+      </w:r>
+      <w:r>
+        <w:rPr>
+          <w:rFonts w:ascii="Arial" w:cs="Arial" w:eastAsia="Arial" w:hAnsi="Arial"/>
+          <w:b w:val="false"/>
+          <w:bCs w:val="false"/>
+          <w:sz w:val="20"/>
+          <w:szCs w:val="20"/>
+          <w:rtl/>
+        </w:rPr>
+        <w:t xml:space="preserve"> و</w:t>
+      </w:r>
+      <w:r>
+        <w:rPr>
+          <w:rFonts w:ascii="Courier New" w:cs="Courier New" w:eastAsia="Courier New" w:hAnsi="Courier New"/>
+          <w:b w:val="false"/>
+          <w:bCs w:val="false"/>
+          <w:color w:val="1F2937"/>
+          <w:sz w:val="18"/>
+          <w:szCs w:val="18"/>
+          <w:shd w:fill="F1F3F5" w:color="auto" w:val="clear"/>
+          <w:rtl/>
+        </w:rPr>
+        <w:t xml:space="preserve">‎usp_RequestPasswordReset‎</w:t>
+      </w:r>
+      <w:r>
+        <w:rPr>
+          <w:rFonts w:ascii="Arial" w:cs="Arial" w:eastAsia="Arial" w:hAnsi="Arial"/>
+          <w:b w:val="false"/>
+          <w:bCs w:val="false"/>
+          <w:sz w:val="20"/>
+          <w:szCs w:val="20"/>
+          <w:rtl/>
+        </w:rPr>
+        <w:t xml:space="preserve"> و</w:t>
+      </w:r>
+      <w:r>
+        <w:rPr>
+          <w:rFonts w:ascii="Courier New" w:cs="Courier New" w:eastAsia="Courier New" w:hAnsi="Courier New"/>
+          <w:b w:val="false"/>
+          <w:bCs w:val="false"/>
+          <w:color w:val="1F2937"/>
+          <w:sz w:val="18"/>
+          <w:szCs w:val="18"/>
+          <w:shd w:fill="F1F3F5" w:color="auto" w:val="clear"/>
+          <w:rtl/>
+        </w:rPr>
+        <w:t xml:space="preserve">‎usp_ResetPassword‎</w:t>
+      </w:r>
+      <w:r>
+        <w:rPr>
+          <w:rFonts w:ascii="Arial" w:cs="Arial" w:eastAsia="Arial" w:hAnsi="Arial"/>
+          <w:b w:val="false"/>
+          <w:bCs w:val="false"/>
+          <w:sz w:val="20"/>
+          <w:szCs w:val="20"/>
+          <w:rtl/>
+        </w:rPr>
+        <w:t xml:space="preserve"> و</w:t>
+      </w:r>
+      <w:r>
+        <w:rPr>
+          <w:rFonts w:ascii="Courier New" w:cs="Courier New" w:eastAsia="Courier New" w:hAnsi="Courier New"/>
+          <w:b w:val="false"/>
+          <w:bCs w:val="false"/>
+          <w:color w:val="1F2937"/>
+          <w:sz w:val="18"/>
+          <w:szCs w:val="18"/>
+          <w:shd w:fill="F1F3F5" w:color="auto" w:val="clear"/>
+          <w:rtl/>
+        </w:rPr>
+        <w:t xml:space="preserve">‎usp_ChangePassword‎</w:t>
+      </w:r>
+      <w:r>
+        <w:rPr>
+          <w:rFonts w:ascii="Arial" w:cs="Arial" w:eastAsia="Arial" w:hAnsi="Arial"/>
+          <w:b w:val="false"/>
+          <w:bCs w:val="false"/>
+          <w:sz w:val="20"/>
+          <w:szCs w:val="20"/>
+          <w:rtl/>
+        </w:rPr>
+        <w:t xml:space="preserve"> و</w:t>
+      </w:r>
+      <w:r>
+        <w:rPr>
+          <w:rFonts w:ascii="Courier New" w:cs="Courier New" w:eastAsia="Courier New" w:hAnsi="Courier New"/>
+          <w:b w:val="false"/>
+          <w:bCs w:val="false"/>
+          <w:color w:val="1F2937"/>
+          <w:sz w:val="18"/>
+          <w:szCs w:val="18"/>
+          <w:shd w:fill="F1F3F5" w:color="auto" w:val="clear"/>
+          <w:rtl/>
+        </w:rPr>
+        <w:t xml:space="preserve">‎usp_EndSession‎</w:t>
+      </w:r>
+      <w:r>
+        <w:rPr>
+          <w:rFonts w:ascii="Arial" w:cs="Arial" w:eastAsia="Arial" w:hAnsi="Arial"/>
+          <w:b w:val="false"/>
+          <w:bCs w:val="false"/>
+          <w:sz w:val="20"/>
+          <w:szCs w:val="20"/>
+          <w:rtl/>
+        </w:rPr>
+        <w:t xml:space="preserve">؛ رابط إعادة تسجيل MFA لمدة 24 ساعة (DQ-F03-8)؛ الخطأ 50006 بعد إثبات كلمة المرور فقط (DQ-F03-11). لم يُبنَ بعد: </w:t>
+      </w:r>
+      <w:r>
+        <w:rPr>
+          <w:rFonts w:ascii="Courier New" w:cs="Courier New" w:eastAsia="Courier New" w:hAnsi="Courier New"/>
+          <w:b w:val="false"/>
+          <w:bCs w:val="false"/>
+          <w:color w:val="1F2937"/>
+          <w:sz w:val="18"/>
+          <w:szCs w:val="18"/>
+          <w:shd w:fill="F1F3F5" w:color="auto" w:val="clear"/>
+          <w:rtl/>
+        </w:rPr>
+        <w:t xml:space="preserve">‎usp_CheckUserToken‎</w:t>
+      </w:r>
+      <w:r>
+        <w:rPr>
+          <w:rFonts w:ascii="Arial" w:cs="Arial" w:eastAsia="Arial" w:hAnsi="Arial"/>
+          <w:b w:val="false"/>
+          <w:bCs w:val="false"/>
+          <w:sz w:val="20"/>
+          <w:szCs w:val="20"/>
+          <w:rtl/>
+        </w:rPr>
+        <w:t xml:space="preserve"> (DQ-F03-5) وحد الدقائق الخمس للجلسة المنتظرة MFA (DQ-F03-2) والتدقيق في aud.AuditLog لمحاولات الدخول (DQ-F03-10).</w:t>
+      </w:r>
+    </w:p>
+    <w:p>
+      <w:pPr>
         <w:pStyle w:val="Heading1"/>
         <w:bidi/>
       </w:pPr>
@@ -5321,9 +5622,9 @@
         </w:tblBorders>
       </w:tblPr>
       <w:tblGrid>
-        <w:gridCol w:w="2901"/>
-        <w:gridCol w:w="1160"/>
-        <w:gridCol w:w="5803"/>
+        <w:gridCol w:w="2689"/>
+        <w:gridCol w:w="1795"/>
+        <w:gridCol w:w="5380"/>
       </w:tblGrid>
       <w:tr>
         <w:trPr>
@@ -5332,7 +5633,7 @@
         </w:trPr>
         <w:tc>
           <w:tcPr>
-            <w:tcW w:type="dxa" w:w="2901"/>
+            <w:tcW w:type="dxa" w:w="2689"/>
             <w:tcBorders>
               <w:top w:val="single" w:color="BFC9D6" w:sz="4"/>
               <w:left w:val="single" w:color="BFC9D6" w:sz="4"/>
@@ -5370,7 +5671,7 @@
         </w:tc>
         <w:tc>
           <w:tcPr>
-            <w:tcW w:type="dxa" w:w="1160"/>
+            <w:tcW w:type="dxa" w:w="1795"/>
             <w:tcBorders>
               <w:top w:val="single" w:color="BFC9D6" w:sz="4"/>
               <w:left w:val="single" w:color="BFC9D6" w:sz="4"/>
@@ -5408,7 +5709,7 @@
         </w:tc>
         <w:tc>
           <w:tcPr>
-            <w:tcW w:type="dxa" w:w="5803"/>
+            <w:tcW w:type="dxa" w:w="5380"/>
             <w:tcBorders>
               <w:top w:val="single" w:color="BFC9D6" w:sz="4"/>
               <w:left w:val="single" w:color="BFC9D6" w:sz="4"/>
@@ -5451,7 +5752,7 @@
         </w:trPr>
         <w:tc>
           <w:tcPr>
-            <w:tcW w:type="dxa" w:w="2901"/>
+            <w:tcW w:type="dxa" w:w="2689"/>
             <w:tcBorders>
               <w:top w:val="single" w:color="BFC9D6" w:sz="4"/>
               <w:left w:val="single" w:color="BFC9D6" w:sz="4"/>
@@ -5487,7 +5788,7 @@
         </w:tc>
         <w:tc>
           <w:tcPr>
-            <w:tcW w:type="dxa" w:w="1160"/>
+            <w:tcW w:type="dxa" w:w="1795"/>
             <w:tcBorders>
               <w:top w:val="single" w:color="BFC9D6" w:sz="4"/>
               <w:left w:val="single" w:color="BFC9D6" w:sz="4"/>
@@ -5522,7 +5823,7 @@
         </w:tc>
         <w:tc>
           <w:tcPr>
-            <w:tcW w:type="dxa" w:w="5803"/>
+            <w:tcW w:type="dxa" w:w="5380"/>
             <w:tcBorders>
               <w:top w:val="single" w:color="BFC9D6" w:sz="4"/>
               <w:left w:val="single" w:color="BFC9D6" w:sz="4"/>
@@ -5563,7 +5864,7 @@
         </w:trPr>
         <w:tc>
           <w:tcPr>
-            <w:tcW w:type="dxa" w:w="2901"/>
+            <w:tcW w:type="dxa" w:w="2689"/>
             <w:tcBorders>
               <w:top w:val="single" w:color="BFC9D6" w:sz="4"/>
               <w:left w:val="single" w:color="BFC9D6" w:sz="4"/>
@@ -5600,7 +5901,7 @@
         </w:tc>
         <w:tc>
           <w:tcPr>
-            <w:tcW w:type="dxa" w:w="1160"/>
+            <w:tcW w:type="dxa" w:w="1795"/>
             <w:tcBorders>
               <w:top w:val="single" w:color="BFC9D6" w:sz="4"/>
               <w:left w:val="single" w:color="BFC9D6" w:sz="4"/>
@@ -5641,13 +5942,13 @@
                 <w:szCs w:val="18"/>
                 <w:rtl/>
               </w:rPr>
-              <w:t xml:space="preserve"> مخاطرة متبقية</w:t>
-            </w:r>
-          </w:p>
-        </w:tc>
-        <w:tc>
-          <w:tcPr>
-            <w:tcW w:type="dxa" w:w="5803"/>
+              <w:t xml:space="preserve"> مخاطرة متبقية مقبولة، ومعها اليوم فحص تكرار الخطوة وحد الإخفاقات في القاعدة</w:t>
+            </w:r>
+          </w:p>
+        </w:tc>
+        <w:tc>
+          <w:tcPr>
+            <w:tcW w:type="dxa" w:w="5380"/>
             <w:tcBorders>
               <w:top w:val="single" w:color="BFC9D6" w:sz="4"/>
               <w:left w:val="single" w:color="BFC9D6" w:sz="4"/>
@@ -5678,7 +5979,7 @@
                 <w:szCs w:val="18"/>
                 <w:rtl/>
               </w:rPr>
-              <w:t xml:space="preserve">030:11-12 و159-162، O-24 (erd_open_items)</w:t>
+              <w:t xml:space="preserve">ADR 0003، الاختباران A5 وA6</w:t>
             </w:r>
           </w:p>
         </w:tc>
@@ -5689,7 +5990,7 @@
         </w:trPr>
         <w:tc>
           <w:tcPr>
-            <w:tcW w:type="dxa" w:w="2901"/>
+            <w:tcW w:type="dxa" w:w="2689"/>
             <w:tcBorders>
               <w:top w:val="single" w:color="BFC9D6" w:sz="4"/>
               <w:left w:val="single" w:color="BFC9D6" w:sz="4"/>
@@ -5725,7 +6026,7 @@
         </w:tc>
         <w:tc>
           <w:tcPr>
-            <w:tcW w:type="dxa" w:w="1160"/>
+            <w:tcW w:type="dxa" w:w="1795"/>
             <w:tcBorders>
               <w:top w:val="single" w:color="BFC9D6" w:sz="4"/>
               <w:left w:val="single" w:color="BFC9D6" w:sz="4"/>
@@ -5760,7 +6061,7 @@
         </w:tc>
         <w:tc>
           <w:tcPr>
-            <w:tcW w:type="dxa" w:w="5803"/>
+            <w:tcW w:type="dxa" w:w="5380"/>
             <w:tcBorders>
               <w:top w:val="single" w:color="BFC9D6" w:sz="4"/>
               <w:left w:val="single" w:color="BFC9D6" w:sz="4"/>
@@ -5801,7 +6102,7 @@
         </w:trPr>
         <w:tc>
           <w:tcPr>
-            <w:tcW w:type="dxa" w:w="2901"/>
+            <w:tcW w:type="dxa" w:w="2689"/>
             <w:tcBorders>
               <w:top w:val="single" w:color="BFC9D6" w:sz="4"/>
               <w:left w:val="single" w:color="BFC9D6" w:sz="4"/>
@@ -5838,7 +6139,7 @@
         </w:tc>
         <w:tc>
           <w:tcPr>
-            <w:tcW w:type="dxa" w:w="1160"/>
+            <w:tcW w:type="dxa" w:w="1795"/>
             <w:tcBorders>
               <w:top w:val="single" w:color="BFC9D6" w:sz="4"/>
               <w:left w:val="single" w:color="BFC9D6" w:sz="4"/>
@@ -5874,7 +6175,7 @@
         </w:tc>
         <w:tc>
           <w:tcPr>
-            <w:tcW w:type="dxa" w:w="5803"/>
+            <w:tcW w:type="dxa" w:w="5380"/>
             <w:tcBorders>
               <w:top w:val="single" w:color="BFC9D6" w:sz="4"/>
               <w:left w:val="single" w:color="BFC9D6" w:sz="4"/>
@@ -5916,7 +6217,7 @@
         </w:trPr>
         <w:tc>
           <w:tcPr>
-            <w:tcW w:type="dxa" w:w="2901"/>
+            <w:tcW w:type="dxa" w:w="2689"/>
             <w:tcBorders>
               <w:top w:val="single" w:color="BFC9D6" w:sz="4"/>
               <w:left w:val="single" w:color="BFC9D6" w:sz="4"/>
@@ -5952,7 +6253,7 @@
         </w:tc>
         <w:tc>
           <w:tcPr>
-            <w:tcW w:type="dxa" w:w="1160"/>
+            <w:tcW w:type="dxa" w:w="1795"/>
             <w:tcBorders>
               <w:top w:val="single" w:color="BFC9D6" w:sz="4"/>
               <w:left w:val="single" w:color="BFC9D6" w:sz="4"/>
@@ -5987,7 +6288,7 @@
         </w:tc>
         <w:tc>
           <w:tcPr>
-            <w:tcW w:type="dxa" w:w="5803"/>
+            <w:tcW w:type="dxa" w:w="5380"/>
             <w:tcBorders>
               <w:top w:val="single" w:color="BFC9D6" w:sz="4"/>
               <w:left w:val="single" w:color="BFC9D6" w:sz="4"/>
@@ -6028,7 +6329,7 @@
         </w:trPr>
         <w:tc>
           <w:tcPr>
-            <w:tcW w:type="dxa" w:w="2901"/>
+            <w:tcW w:type="dxa" w:w="2689"/>
             <w:tcBorders>
               <w:top w:val="single" w:color="BFC9D6" w:sz="4"/>
               <w:left w:val="single" w:color="BFC9D6" w:sz="4"/>
@@ -6065,7 +6366,7 @@
         </w:tc>
         <w:tc>
           <w:tcPr>
-            <w:tcW w:type="dxa" w:w="1160"/>
+            <w:tcW w:type="dxa" w:w="1795"/>
             <w:tcBorders>
               <w:top w:val="single" w:color="BFC9D6" w:sz="4"/>
               <w:left w:val="single" w:color="BFC9D6" w:sz="4"/>
@@ -6101,7 +6402,7 @@
         </w:tc>
         <w:tc>
           <w:tcPr>
-            <w:tcW w:type="dxa" w:w="5803"/>
+            <w:tcW w:type="dxa" w:w="5380"/>
             <w:tcBorders>
               <w:top w:val="single" w:color="BFC9D6" w:sz="4"/>
               <w:left w:val="single" w:color="BFC9D6" w:sz="4"/>
@@ -6143,119 +6444,118 @@
         </w:trPr>
         <w:tc>
           <w:tcPr>
-            <w:tcW w:type="dxa" w:w="2901"/>
-            <w:tcBorders>
-              <w:top w:val="single" w:color="BFC9D6" w:sz="4"/>
-              <w:left w:val="single" w:color="BFC9D6" w:sz="4"/>
-              <w:bottom w:val="single" w:color="BFC9D6" w:sz="4"/>
-              <w:right w:val="single" w:color="BFC9D6" w:sz="4"/>
-            </w:tcBorders>
-            <w:tcMar>
-              <w:top w:type="dxa" w:w="50"/>
-              <w:left w:type="dxa" w:w="90"/>
-              <w:bottom w:type="dxa" w:w="50"/>
-              <w:right w:type="dxa" w:w="90"/>
-            </w:tcMar>
-            <w:vAlign w:val="top"/>
-          </w:tcPr>
-          <w:p>
-            <w:pPr>
-              <w:keepNext w:val="false"/>
-              <w:bidi/>
-              <w:spacing w:after="30" w:before="30" w:line="264"/>
-            </w:pPr>
-            <w:r>
-              <w:rPr>
-                <w:rFonts w:ascii="Arial" w:cs="Arial" w:eastAsia="Arial" w:hAnsi="Arial"/>
-                <w:b w:val="false"/>
-                <w:bCs w:val="false"/>
-                <w:sz w:val="18"/>
-                <w:szCs w:val="18"/>
-                <w:rtl/>
-              </w:rPr>
-              <w:t xml:space="preserve">مستخدم MfaEnabled = 0 تُربط جلسته بلا MFA اليوم</w:t>
-            </w:r>
-          </w:p>
-        </w:tc>
-        <w:tc>
-          <w:tcPr>
-            <w:tcW w:type="dxa" w:w="1160"/>
-            <w:tcBorders>
-              <w:top w:val="single" w:color="BFC9D6" w:sz="4"/>
-              <w:left w:val="single" w:color="BFC9D6" w:sz="4"/>
-              <w:bottom w:val="single" w:color="BFC9D6" w:sz="4"/>
-              <w:right w:val="single" w:color="BFC9D6" w:sz="4"/>
-            </w:tcBorders>
-            <w:tcMar>
-              <w:top w:type="dxa" w:w="50"/>
-              <w:left w:type="dxa" w:w="90"/>
-              <w:bottom w:type="dxa" w:w="50"/>
-              <w:right w:type="dxa" w:w="90"/>
-            </w:tcMar>
-            <w:vAlign w:val="top"/>
-          </w:tcPr>
-          <w:p>
-            <w:pPr>
-              <w:keepNext w:val="false"/>
-              <w:bidi/>
-              <w:spacing w:after="30" w:before="30" w:line="264"/>
-            </w:pPr>
-            <w:r>
-              <w:rPr>
-                <w:rFonts w:ascii="Arial" w:cs="Arial" w:eastAsia="Arial" w:hAnsi="Arial"/>
-                <w:color w:val="2E9E44"/>
-                <w:sz w:val="18"/>
-                <w:szCs w:val="18"/>
-                <w:rtl/>
-              </w:rPr>
-              <w:t xml:space="preserve">●</w:t>
-            </w:r>
-            <w:r>
-              <w:rPr>
-                <w:rFonts w:ascii="Arial" w:cs="Arial" w:eastAsia="Arial" w:hAnsi="Arial"/>
-                <w:b w:val="false"/>
-                <w:bCs w:val="false"/>
-                <w:sz w:val="18"/>
-                <w:szCs w:val="18"/>
-                <w:rtl/>
-              </w:rPr>
-              <w:t xml:space="preserve"> فجوة</w:t>
-            </w:r>
-          </w:p>
-        </w:tc>
-        <w:tc>
-          <w:tcPr>
-            <w:tcW w:type="dxa" w:w="5803"/>
-            <w:tcBorders>
-              <w:top w:val="single" w:color="BFC9D6" w:sz="4"/>
-              <w:left w:val="single" w:color="BFC9D6" w:sz="4"/>
-              <w:bottom w:val="single" w:color="BFC9D6" w:sz="4"/>
-              <w:right w:val="single" w:color="BFC9D6" w:sz="4"/>
-            </w:tcBorders>
-            <w:tcMar>
-              <w:top w:type="dxa" w:w="50"/>
-              <w:left w:type="dxa" w:w="90"/>
-              <w:bottom w:type="dxa" w:w="50"/>
-              <w:right w:type="dxa" w:w="90"/>
-            </w:tcMar>
-            <w:vAlign w:val="top"/>
-          </w:tcPr>
-          <w:p>
-            <w:pPr>
-              <w:keepNext w:val="false"/>
-              <w:bidi/>
-              <w:spacing w:after="30" w:before="30" w:line="264"/>
-            </w:pPr>
-            <w:r>
-              <w:rPr>
-                <w:rFonts w:ascii="Arial" w:cs="Arial" w:eastAsia="Arial" w:hAnsi="Arial"/>
-                <w:b w:val="false"/>
-                <w:bCs w:val="false"/>
-                <w:sz w:val="18"/>
-                <w:szCs w:val="18"/>
-                <w:rtl/>
-              </w:rPr>
-              <w:t xml:space="preserve">030:198. الاقتراح في DQ-F03-4</w:t>
+            <w:tcW w:type="dxa" w:w="2689"/>
+            <w:tcBorders>
+              <w:top w:val="single" w:color="BFC9D6" w:sz="4"/>
+              <w:left w:val="single" w:color="BFC9D6" w:sz="4"/>
+              <w:bottom w:val="single" w:color="BFC9D6" w:sz="4"/>
+              <w:right w:val="single" w:color="BFC9D6" w:sz="4"/>
+            </w:tcBorders>
+            <w:tcMar>
+              <w:top w:type="dxa" w:w="50"/>
+              <w:left w:type="dxa" w:w="90"/>
+              <w:bottom w:type="dxa" w:w="50"/>
+              <w:right w:type="dxa" w:w="90"/>
+            </w:tcMar>
+            <w:vAlign w:val="top"/>
+          </w:tcPr>
+          <w:p>
+            <w:pPr>
+              <w:keepNext w:val="false"/>
+              <w:bidi/>
+              <w:spacing w:after="30" w:before="30" w:line="264"/>
+            </w:pPr>
+            <w:r>
+              <w:rPr>
+                <w:rFonts w:ascii="Arial" w:cs="Arial" w:eastAsia="Arial" w:hAnsi="Arial"/>
+                <w:b w:val="false"/>
+                <w:bCs w:val="false"/>
+                <w:sz w:val="18"/>
+                <w:szCs w:val="18"/>
+                <w:rtl/>
+              </w:rPr>
+              <w:t xml:space="preserve">مستخدم MfaEnabled = 0 تُربط جلسته بلا MFA</w:t>
+            </w:r>
+          </w:p>
+        </w:tc>
+        <w:tc>
+          <w:tcPr>
+            <w:tcW w:type="dxa" w:w="1795"/>
+            <w:tcBorders>
+              <w:top w:val="single" w:color="BFC9D6" w:sz="4"/>
+              <w:left w:val="single" w:color="BFC9D6" w:sz="4"/>
+              <w:bottom w:val="single" w:color="BFC9D6" w:sz="4"/>
+              <w:right w:val="single" w:color="BFC9D6" w:sz="4"/>
+            </w:tcBorders>
+            <w:tcMar>
+              <w:top w:type="dxa" w:w="50"/>
+              <w:left w:type="dxa" w:w="90"/>
+              <w:bottom w:type="dxa" w:w="50"/>
+              <w:right w:type="dxa" w:w="90"/>
+            </w:tcMar>
+            <w:vAlign w:val="top"/>
+          </w:tcPr>
+          <w:p>
+            <w:pPr>
+              <w:keepNext w:val="false"/>
+              <w:bidi/>
+              <w:spacing w:after="30" w:before="30" w:line="264"/>
+            </w:pPr>
+            <w:r>
+              <w:rPr>
+                <w:rFonts w:ascii="Segoe UI Emoji" w:cs="Segoe UI Emoji" w:eastAsia="Segoe UI Emoji" w:hAnsi="Segoe UI Emoji"/>
+                <w:sz w:val="18"/>
+                <w:szCs w:val="18"/>
+                <w:rtl/>
+              </w:rPr>
+              <w:t xml:space="preserve">✅</w:t>
+            </w:r>
+            <w:r>
+              <w:rPr>
+                <w:rFonts w:ascii="Arial" w:cs="Arial" w:eastAsia="Arial" w:hAnsi="Arial"/>
+                <w:b w:val="false"/>
+                <w:bCs w:val="false"/>
+                <w:sz w:val="18"/>
+                <w:szCs w:val="18"/>
+                <w:rtl/>
+              </w:rPr>
+              <w:t xml:space="preserve"> أُغلقت (ADR 0003)</w:t>
+            </w:r>
+          </w:p>
+        </w:tc>
+        <w:tc>
+          <w:tcPr>
+            <w:tcW w:type="dxa" w:w="5380"/>
+            <w:tcBorders>
+              <w:top w:val="single" w:color="BFC9D6" w:sz="4"/>
+              <w:left w:val="single" w:color="BFC9D6" w:sz="4"/>
+              <w:bottom w:val="single" w:color="BFC9D6" w:sz="4"/>
+              <w:right w:val="single" w:color="BFC9D6" w:sz="4"/>
+            </w:tcBorders>
+            <w:tcMar>
+              <w:top w:type="dxa" w:w="50"/>
+              <w:left w:type="dxa" w:w="90"/>
+              <w:bottom w:type="dxa" w:w="50"/>
+              <w:right w:type="dxa" w:w="90"/>
+            </w:tcMar>
+            <w:vAlign w:val="top"/>
+          </w:tcPr>
+          <w:p>
+            <w:pPr>
+              <w:keepNext w:val="false"/>
+              <w:bidi/>
+              <w:spacing w:after="30" w:before="30" w:line="264"/>
+            </w:pPr>
+            <w:r>
+              <w:rPr>
+                <w:rFonts w:ascii="Arial" w:cs="Arial" w:eastAsia="Arial" w:hAnsi="Arial"/>
+                <w:b w:val="false"/>
+                <w:bCs w:val="false"/>
+                <w:sz w:val="18"/>
+                <w:szCs w:val="18"/>
+                <w:rtl/>
+              </w:rPr>
+              <w:t xml:space="preserve">الربط يشترط MfaVerifiedAt؛ الاختباران T43 وA14</w:t>
             </w:r>
           </w:p>
         </w:tc>
@@ -6788,14 +7088,27 @@
             </w:pPr>
             <w:r>
               <w:rPr>
-                <w:rFonts w:ascii="Arial" w:cs="Arial" w:eastAsia="Arial" w:hAnsi="Arial"/>
-                <w:b w:val="false"/>
-                <w:bCs w:val="false"/>
-                <w:sz w:val="18"/>
-                <w:szCs w:val="18"/>
-                <w:rtl/>
-              </w:rPr>
-              <w:t xml:space="preserve">يحدّثه التطبيق</w:t>
+                <w:rFonts w:ascii="Courier New" w:cs="Courier New" w:eastAsia="Courier New" w:hAnsi="Courier New"/>
+                <w:b w:val="false"/>
+                <w:bCs w:val="false"/>
+                <w:color w:val="1F2937"/>
+                <w:sz w:val="16"/>
+                <w:szCs w:val="16"/>
+                <w:shd w:fill="F1F3F5" w:color="auto" w:val="clear"/>
+                <w:rtl/>
+              </w:rPr>
+              <w:t xml:space="preserve">‎sec.usp_TouchSession‎</w:t>
+            </w:r>
+            <w:r>
+              <w:rPr>
+                <w:rFonts w:ascii="Arial" w:cs="Arial" w:eastAsia="Arial" w:hAnsi="Arial"/>
+                <w:b w:val="false"/>
+                <w:bCs w:val="false"/>
+                <w:sz w:val="18"/>
+                <w:szCs w:val="18"/>
+                <w:rtl/>
+              </w:rPr>
+              <w:t xml:space="preserve"> (035)</w:t>
             </w:r>
           </w:p>
         </w:tc>
@@ -6824,24 +7137,23 @@
             </w:pPr>
             <w:r>
               <w:rPr>
-                <w:rFonts w:ascii="Arial" w:cs="Arial" w:eastAsia="Arial" w:hAnsi="Arial"/>
-                <w:color w:val="2E9E44"/>
-                <w:sz w:val="18"/>
-                <w:szCs w:val="18"/>
-                <w:rtl/>
-              </w:rPr>
-              <w:t xml:space="preserve">●</w:t>
-            </w:r>
-            <w:r>
-              <w:rPr>
-                <w:rFonts w:ascii="Arial" w:cs="Arial" w:eastAsia="Arial" w:hAnsi="Arial"/>
-                <w:b w:val="false"/>
-                <w:bCs w:val="false"/>
-                <w:sz w:val="18"/>
-                <w:szCs w:val="18"/>
-                <w:rtl/>
-              </w:rPr>
-              <w:t xml:space="preserve"> مخاطرة متبقية O-24؛ الاقتراح في DOC-S03 §12 (R3)</w:t>
+                <w:rFonts w:ascii="Segoe UI Emoji" w:cs="Segoe UI Emoji" w:eastAsia="Segoe UI Emoji" w:hAnsi="Segoe UI Emoji"/>
+                <w:sz w:val="18"/>
+                <w:szCs w:val="18"/>
+                <w:rtl/>
+              </w:rPr>
+              <w:t xml:space="preserve">✅</w:t>
+            </w:r>
+            <w:r>
+              <w:rPr>
+                <w:rFonts w:ascii="Arial" w:cs="Arial" w:eastAsia="Arial" w:hAnsi="Arial"/>
+                <w:b w:val="false"/>
+                <w:bCs w:val="false"/>
+                <w:sz w:val="18"/>
+                <w:szCs w:val="18"/>
+                <w:rtl/>
+              </w:rPr>
+              <w:t xml:space="preserve"> أُغلقت (ADR 0003)؛ الاختبار A12</w:t>
             </w:r>
           </w:p>
         </w:tc>
@@ -10197,14 +10509,23 @@
             </w:pPr>
             <w:r>
               <w:rPr>
-                <w:rFonts w:ascii="Arial" w:cs="Arial" w:eastAsia="Arial" w:hAnsi="Arial"/>
-                <w:b w:val="false"/>
-                <w:bCs w:val="false"/>
-                <w:sz w:val="18"/>
-                <w:szCs w:val="18"/>
-                <w:rtl/>
-              </w:rPr>
-              <w:t xml:space="preserve">في S0، بإجراءات ضيقة بصفة tp_auth_exec على نمط ADR 0002، بلا usp_SetAuthContext، في ADR جديد</w:t>
+                <w:rFonts w:ascii="Segoe UI Emoji" w:cs="Segoe UI Emoji" w:eastAsia="Segoe UI Emoji" w:hAnsi="Segoe UI Emoji"/>
+                <w:sz w:val="18"/>
+                <w:szCs w:val="18"/>
+                <w:rtl/>
+              </w:rPr>
+              <w:t xml:space="preserve">✅</w:t>
+            </w:r>
+            <w:r>
+              <w:rPr>
+                <w:rFonts w:ascii="Arial" w:cs="Arial" w:eastAsia="Arial" w:hAnsi="Arial"/>
+                <w:b w:val="false"/>
+                <w:bCs w:val="false"/>
+                <w:sz w:val="18"/>
+                <w:szCs w:val="18"/>
+                <w:rtl/>
+              </w:rPr>
+              <w:t xml:space="preserve"> معتمد من المالك (2026-10-12): في S0، بإجراءات ضيقة بصفة tp_auth_exec على نمط ADR 0002، بلا usp_SetAuthContext، في ADR جديد</w:t>
             </w:r>
           </w:p>
         </w:tc>
@@ -10760,14 +11081,23 @@
             </w:pPr>
             <w:r>
               <w:rPr>
-                <w:rFonts w:ascii="Arial" w:cs="Arial" w:eastAsia="Arial" w:hAnsi="Arial"/>
-                <w:b w:val="false"/>
-                <w:bCs w:val="false"/>
-                <w:sz w:val="18"/>
-                <w:szCs w:val="18"/>
-                <w:rtl/>
-              </w:rPr>
-              <w:t xml:space="preserve">لا: الربط يشترط MfaVerifiedAt لكل مستخدم غير خدمي، والتسجيل بإجراء؛ يتفق مع DQ-S01-3 ومع خطوة O-24 التالية (tools/dbgen/erd_open_items.py:155)</w:t>
+                <w:rFonts w:ascii="Segoe UI Emoji" w:cs="Segoe UI Emoji" w:eastAsia="Segoe UI Emoji" w:hAnsi="Segoe UI Emoji"/>
+                <w:sz w:val="18"/>
+                <w:szCs w:val="18"/>
+                <w:rtl/>
+              </w:rPr>
+              <w:t xml:space="preserve">✅</w:t>
+            </w:r>
+            <w:r>
+              <w:rPr>
+                <w:rFonts w:ascii="Arial" w:cs="Arial" w:eastAsia="Arial" w:hAnsi="Arial"/>
+                <w:b w:val="false"/>
+                <w:bCs w:val="false"/>
+                <w:sz w:val="18"/>
+                <w:szCs w:val="18"/>
+                <w:rtl/>
+              </w:rPr>
+              <w:t xml:space="preserve"> معتمد من المالك (2026-10-12): لا: الربط يشترط MfaVerifiedAt لكل مستخدم غير خدمي، والتسجيل بإجراء؛ يتفق مع DQ-S01-3 ومع خطوة O-24 التالية (tools/dbgen/erd_open_items.py:155)</w:t>
             </w:r>
           </w:p>
         </w:tc>
@@ -11510,14 +11840,23 @@
             </w:pPr>
             <w:r>
               <w:rPr>
-                <w:rFonts w:ascii="Arial" w:cs="Arial" w:eastAsia="Arial" w:hAnsi="Arial"/>
-                <w:b w:val="false"/>
-                <w:bCs w:val="false"/>
-                <w:sz w:val="18"/>
-                <w:szCs w:val="18"/>
-                <w:rtl/>
-              </w:rPr>
-              <w:t xml:space="preserve">رابط 24 ساعة بغرض جديد MFA_REENROLMENT في sec.UserToken.Purpose، وتعديل FR-PLT-013 لرسالة ثالثة</w:t>
+                <w:rFonts w:ascii="Segoe UI Emoji" w:cs="Segoe UI Emoji" w:eastAsia="Segoe UI Emoji" w:hAnsi="Segoe UI Emoji"/>
+                <w:sz w:val="18"/>
+                <w:szCs w:val="18"/>
+                <w:rtl/>
+              </w:rPr>
+              <w:t xml:space="preserve">✅</w:t>
+            </w:r>
+            <w:r>
+              <w:rPr>
+                <w:rFonts w:ascii="Arial" w:cs="Arial" w:eastAsia="Arial" w:hAnsi="Arial"/>
+                <w:b w:val="false"/>
+                <w:bCs w:val="false"/>
+                <w:sz w:val="18"/>
+                <w:szCs w:val="18"/>
+                <w:rtl/>
+              </w:rPr>
+              <w:t xml:space="preserve"> معتمد من المالك (2026-10-12): رابط 24 ساعة بغرض جديد MFA_REENROLMENT في sec.UserToken.Purpose، وتعديل FR-PLT-013 لرسالة ثالثة</w:t>
             </w:r>
           </w:p>
         </w:tc>
@@ -12072,14 +12411,23 @@
             </w:pPr>
             <w:r>
               <w:rPr>
-                <w:rFonts w:ascii="Arial" w:cs="Arial" w:eastAsia="Arial" w:hAnsi="Arial"/>
-                <w:b w:val="false"/>
-                <w:bCs w:val="false"/>
-                <w:sz w:val="18"/>
-                <w:szCs w:val="18"/>
-                <w:rtl/>
-              </w:rPr>
-              <w:t xml:space="preserve">يُقبل 50006 المقترح في DQ-F04-3 بشرط رفعه بعد نجاح المقارنة فقط، مع تعديل docs/adr/0002-login-and-session-bound-context.md:20</w:t>
+                <w:rFonts w:ascii="Segoe UI Emoji" w:cs="Segoe UI Emoji" w:eastAsia="Segoe UI Emoji" w:hAnsi="Segoe UI Emoji"/>
+                <w:sz w:val="18"/>
+                <w:szCs w:val="18"/>
+                <w:rtl/>
+              </w:rPr>
+              <w:t xml:space="preserve">✅</w:t>
+            </w:r>
+            <w:r>
+              <w:rPr>
+                <w:rFonts w:ascii="Arial" w:cs="Arial" w:eastAsia="Arial" w:hAnsi="Arial"/>
+                <w:b w:val="false"/>
+                <w:bCs w:val="false"/>
+                <w:sz w:val="18"/>
+                <w:szCs w:val="18"/>
+                <w:rtl/>
+              </w:rPr>
+              <w:t xml:space="preserve"> معتمد من المالك (2026-10-12): يُقبل 50006 المقترح في DQ-F04-3 بشرط رفعه بعد نجاح المقارنة فقط، مع تعديل docs/adr/0002-login-and-session-bound-context.md:20</w:t>
             </w:r>
           </w:p>
         </w:tc>
@@ -13109,14 +13457,23 @@
             </w:pPr>
             <w:r>
               <w:rPr>
-                <w:rFonts w:ascii="Arial" w:cs="Arial" w:eastAsia="Arial" w:hAnsi="Arial"/>
-                <w:b w:val="false"/>
-                <w:bCs w:val="false"/>
-                <w:sz w:val="18"/>
-                <w:szCs w:val="18"/>
-                <w:rtl/>
-              </w:rPr>
-              <w:t xml:space="preserve">ينص على 50005 لكل فشل، وDOC-F04 يقترح 50006 لعضو أثبت كلمة مروره ورُفض بحالة المشترك (DQ-F04-3)؛ الموقف في DQ-F03-11</w:t>
+                <w:rFonts w:ascii="Segoe UI Emoji" w:cs="Segoe UI Emoji" w:eastAsia="Segoe UI Emoji" w:hAnsi="Segoe UI Emoji"/>
+                <w:sz w:val="18"/>
+                <w:szCs w:val="18"/>
+                <w:rtl/>
+              </w:rPr>
+              <w:t xml:space="preserve">✅</w:t>
+            </w:r>
+            <w:r>
+              <w:rPr>
+                <w:rFonts w:ascii="Arial" w:cs="Arial" w:eastAsia="Arial" w:hAnsi="Arial"/>
+                <w:b w:val="false"/>
+                <w:bCs w:val="false"/>
+                <w:sz w:val="18"/>
+                <w:szCs w:val="18"/>
+                <w:rtl/>
+              </w:rPr>
+              <w:t xml:space="preserve"> عُدّل ADR 0002 بعد DQ-F03-11: 50005 لكل فشل قبل إثبات كلمة المرور، و50006 بعده فقط (T42)</w:t>
             </w:r>
           </w:p>
         </w:tc>
@@ -13225,14 +13582,23 @@
             </w:pPr>
             <w:r>
               <w:rPr>
-                <w:rFonts w:ascii="Arial" w:cs="Arial" w:eastAsia="Arial" w:hAnsi="Arial"/>
-                <w:b w:val="false"/>
-                <w:bCs w:val="false"/>
-                <w:sz w:val="18"/>
-                <w:szCs w:val="18"/>
-                <w:rtl/>
-              </w:rPr>
-              <w:t xml:space="preserve">تقبل SUSPENDED وARCHIVED_READ_ONLY لأي مستخدم وترفض CLOSED، خلافًا لـ BR-PLT-002؛ يعالجه DOC-F04 (O-18)</w:t>
+                <w:rFonts w:ascii="Segoe UI Emoji" w:cs="Segoe UI Emoji" w:eastAsia="Segoe UI Emoji" w:hAnsi="Segoe UI Emoji"/>
+                <w:sz w:val="18"/>
+                <w:szCs w:val="18"/>
+                <w:rtl/>
+              </w:rPr>
+              <w:t xml:space="preserve">✅</w:t>
+            </w:r>
+            <w:r>
+              <w:rPr>
+                <w:rFonts w:ascii="Arial" w:cs="Arial" w:eastAsia="Arial" w:hAnsi="Arial"/>
+                <w:b w:val="false"/>
+                <w:bCs w:val="false"/>
+                <w:sz w:val="18"/>
+                <w:szCs w:val="18"/>
+                <w:rtl/>
+              </w:rPr>
+              <w:t xml:space="preserve"> أُغلق O-18 بالخيار (أ): sec.fn_TenantLoginAllowed (T40 وT41)</w:t>
             </w:r>
           </w:p>
         </w:tc>

</xml_diff>